<commit_message>
Add user administration test coverage
</commit_message>
<xml_diff>
--- a/Test-Plan/Test_Plan_Vehicle_Service_Maintenance.docx
+++ b/Test-Plan/Test_Plan_Vehicle_Service_Maintenance.docx
@@ -3572,6 +3572,181 @@
     <w:p/>
     <w:p>
       <w:pPr>
+        <w:rPr>
+          <w:lang w:val="en-IN"/>
+        </w:rPr>
+      </w:pPr>
+      <w:r>
+        <w:rPr>
+          <w:b/>
+          <w:bCs/>
+          <w:lang w:val="en-IN"/>
+        </w:rPr>
+        <w:t>Additional Test Coverage for FR-006: User &amp; Access Administration</w:t>
+      </w:r>
+    </w:p>
+    <w:p>
+      <w:pPr>
+        <w:rPr>
+          <w:lang w:val="en-IN"/>
+        </w:rPr>
+      </w:pPr>
+      <w:r>
+        <w:rPr>
+          <w:lang w:val="en-IN"/>
+        </w:rPr>
+        <w:t>The following scenarios supplement the existing test-case baseline:</w:t>
+      </w:r>
+    </w:p>
+    <w:p>
+      <w:pPr>
+        <w:numPr>
+          <w:ilvl w:val="0"/>
+          <w:numId w:val="11"/>
+        </w:numPr>
+        <w:rPr>
+          <w:lang w:val="en-IN"/>
+        </w:rPr>
+      </w:pPr>
+      <w:r>
+        <w:rPr>
+          <w:b/>
+          <w:bCs/>
+          <w:lang w:val="en-IN"/>
+        </w:rPr>
+        <w:t>TC-ADMIN-01 — User Creation:</w:t>
+      </w:r>
+      <w:r>
+        <w:rPr>
+          <w:lang w:val="en-IN"/>
+        </w:rPr>
+        <w:t xml:space="preserve"> Verify that an administrator can create a user with valid details and an assigned role.</w:t>
+      </w:r>
+    </w:p>
+    <w:p>
+      <w:pPr>
+        <w:numPr>
+          <w:ilvl w:val="0"/>
+          <w:numId w:val="11"/>
+        </w:numPr>
+        <w:rPr>
+          <w:lang w:val="en-IN"/>
+        </w:rPr>
+      </w:pPr>
+      <w:r>
+        <w:rPr>
+          <w:b/>
+          <w:bCs/>
+          <w:lang w:val="en-IN"/>
+        </w:rPr>
+        <w:t>TC-ADMIN-02 — User Deactivation:</w:t>
+      </w:r>
+      <w:r>
+        <w:rPr>
+          <w:lang w:val="en-IN"/>
+        </w:rPr>
+        <w:t xml:space="preserve"> Verify that a deactivated user cannot log in, while historical records remain accessible to authorized staff.</w:t>
+      </w:r>
+    </w:p>
+    <w:p>
+      <w:pPr>
+        <w:numPr>
+          <w:ilvl w:val="0"/>
+          <w:numId w:val="11"/>
+        </w:numPr>
+        <w:rPr>
+          <w:lang w:val="en-IN"/>
+        </w:rPr>
+      </w:pPr>
+      <w:r>
+        <w:rPr>
+          <w:b/>
+          <w:bCs/>
+          <w:lang w:val="en-IN"/>
+        </w:rPr>
+        <w:t>TC-ADMIN-03 — Role Modification:</w:t>
+      </w:r>
+      <w:r>
+        <w:rPr>
+          <w:lang w:val="en-IN"/>
+        </w:rPr>
+        <w:t xml:space="preserve"> Verify that changing a user's role updates the permissions available to that user.</w:t>
+      </w:r>
+    </w:p>
+    <w:p>
+      <w:pPr>
+        <w:numPr>
+          <w:ilvl w:val="0"/>
+          <w:numId w:val="11"/>
+        </w:numPr>
+        <w:rPr>
+          <w:lang w:val="en-IN"/>
+        </w:rPr>
+      </w:pPr>
+      <w:r>
+        <w:rPr>
+          <w:b/>
+          <w:bCs/>
+          <w:lang w:val="en-IN"/>
+        </w:rPr>
+        <w:t>TC-ADMIN-04 — Unauthorized Access:</w:t>
+      </w:r>
+      <w:r>
+        <w:rPr>
+          <w:lang w:val="en-IN"/>
+        </w:rPr>
+        <w:t xml:space="preserve"> Verify that users cannot access functions restricted to other roles.</w:t>
+      </w:r>
+    </w:p>
+    <w:p>
+      <w:pPr>
+        <w:numPr>
+          <w:ilvl w:val="0"/>
+          <w:numId w:val="11"/>
+        </w:numPr>
+        <w:rPr>
+          <w:lang w:val="en-IN"/>
+        </w:rPr>
+      </w:pPr>
+      <w:r>
+        <w:rPr>
+          <w:b/>
+          <w:bCs/>
+          <w:lang w:val="en-IN"/>
+        </w:rPr>
+        <w:t>TC-ADMIN-05 — Configuration Access:</w:t>
+      </w:r>
+      <w:r>
+        <w:rPr>
+          <w:lang w:val="en-IN"/>
+        </w:rPr>
+        <w:t xml:space="preserve"> Verify that only authorized administrators can modify system-wide settings.</w:t>
+      </w:r>
+    </w:p>
+    <w:p>
+      <w:pPr>
+        <w:rPr>
+          <w:lang w:val="en-IN"/>
+        </w:rPr>
+      </w:pPr>
+      <w:r>
+        <w:rPr>
+          <w:b/>
+          <w:bCs/>
+          <w:lang w:val="en-IN"/>
+        </w:rPr>
+        <w:t>Expected Result:</w:t>
+      </w:r>
+      <w:r>
+        <w:rPr>
+          <w:lang w:val="en-IN"/>
+        </w:rPr>
+        <w:t xml:space="preserve"> All five scenarios should produce the specified access-control behaviour. Any deviation must be recorded as a defect and retested after correction.</w:t>
+      </w:r>
+    </w:p>
+    <w:p/>
+    <w:p>
+      <w:pPr>
         <w:pStyle w:val="Heading2"/>
       </w:pPr>
       <w:r>
@@ -3649,6 +3824,7 @@
     </w:p>
     <w:p>
       <w:r>
+        <w:lastRenderedPageBreak/>
         <w:t>Reports:</w:t>
       </w:r>
     </w:p>
@@ -4118,6 +4294,155 @@
     <w:nsid w:val="110517C1"/>
     <w:multiLevelType w:val="multilevel"/>
     <w:tmpl w:val="F88237E0"/>
+    <w:lvl w:ilvl="0">
+      <w:start w:val="1"/>
+      <w:numFmt w:val="bullet"/>
+      <w:lvlText w:val=""/>
+      <w:lvlJc w:val="left"/>
+      <w:pPr>
+        <w:tabs>
+          <w:tab w:val="num" w:pos="720"/>
+        </w:tabs>
+        <w:ind w:left="720" w:hanging="360"/>
+      </w:pPr>
+      <w:rPr>
+        <w:rFonts w:ascii="Symbol" w:hAnsi="Symbol" w:hint="default"/>
+        <w:sz w:val="20"/>
+      </w:rPr>
+    </w:lvl>
+    <w:lvl w:ilvl="1" w:tentative="1">
+      <w:start w:val="1"/>
+      <w:numFmt w:val="bullet"/>
+      <w:lvlText w:val="o"/>
+      <w:lvlJc w:val="left"/>
+      <w:pPr>
+        <w:tabs>
+          <w:tab w:val="num" w:pos="1440"/>
+        </w:tabs>
+        <w:ind w:left="1440" w:hanging="360"/>
+      </w:pPr>
+      <w:rPr>
+        <w:rFonts w:ascii="Courier New" w:hAnsi="Courier New" w:hint="default"/>
+        <w:sz w:val="20"/>
+      </w:rPr>
+    </w:lvl>
+    <w:lvl w:ilvl="2" w:tentative="1">
+      <w:start w:val="1"/>
+      <w:numFmt w:val="bullet"/>
+      <w:lvlText w:val=""/>
+      <w:lvlJc w:val="left"/>
+      <w:pPr>
+        <w:tabs>
+          <w:tab w:val="num" w:pos="2160"/>
+        </w:tabs>
+        <w:ind w:left="2160" w:hanging="360"/>
+      </w:pPr>
+      <w:rPr>
+        <w:rFonts w:ascii="Wingdings" w:hAnsi="Wingdings" w:hint="default"/>
+        <w:sz w:val="20"/>
+      </w:rPr>
+    </w:lvl>
+    <w:lvl w:ilvl="3" w:tentative="1">
+      <w:start w:val="1"/>
+      <w:numFmt w:val="bullet"/>
+      <w:lvlText w:val=""/>
+      <w:lvlJc w:val="left"/>
+      <w:pPr>
+        <w:tabs>
+          <w:tab w:val="num" w:pos="2880"/>
+        </w:tabs>
+        <w:ind w:left="2880" w:hanging="360"/>
+      </w:pPr>
+      <w:rPr>
+        <w:rFonts w:ascii="Wingdings" w:hAnsi="Wingdings" w:hint="default"/>
+        <w:sz w:val="20"/>
+      </w:rPr>
+    </w:lvl>
+    <w:lvl w:ilvl="4" w:tentative="1">
+      <w:start w:val="1"/>
+      <w:numFmt w:val="bullet"/>
+      <w:lvlText w:val=""/>
+      <w:lvlJc w:val="left"/>
+      <w:pPr>
+        <w:tabs>
+          <w:tab w:val="num" w:pos="3600"/>
+        </w:tabs>
+        <w:ind w:left="3600" w:hanging="360"/>
+      </w:pPr>
+      <w:rPr>
+        <w:rFonts w:ascii="Wingdings" w:hAnsi="Wingdings" w:hint="default"/>
+        <w:sz w:val="20"/>
+      </w:rPr>
+    </w:lvl>
+    <w:lvl w:ilvl="5" w:tentative="1">
+      <w:start w:val="1"/>
+      <w:numFmt w:val="bullet"/>
+      <w:lvlText w:val=""/>
+      <w:lvlJc w:val="left"/>
+      <w:pPr>
+        <w:tabs>
+          <w:tab w:val="num" w:pos="4320"/>
+        </w:tabs>
+        <w:ind w:left="4320" w:hanging="360"/>
+      </w:pPr>
+      <w:rPr>
+        <w:rFonts w:ascii="Wingdings" w:hAnsi="Wingdings" w:hint="default"/>
+        <w:sz w:val="20"/>
+      </w:rPr>
+    </w:lvl>
+    <w:lvl w:ilvl="6" w:tentative="1">
+      <w:start w:val="1"/>
+      <w:numFmt w:val="bullet"/>
+      <w:lvlText w:val=""/>
+      <w:lvlJc w:val="left"/>
+      <w:pPr>
+        <w:tabs>
+          <w:tab w:val="num" w:pos="5040"/>
+        </w:tabs>
+        <w:ind w:left="5040" w:hanging="360"/>
+      </w:pPr>
+      <w:rPr>
+        <w:rFonts w:ascii="Wingdings" w:hAnsi="Wingdings" w:hint="default"/>
+        <w:sz w:val="20"/>
+      </w:rPr>
+    </w:lvl>
+    <w:lvl w:ilvl="7" w:tentative="1">
+      <w:start w:val="1"/>
+      <w:numFmt w:val="bullet"/>
+      <w:lvlText w:val=""/>
+      <w:lvlJc w:val="left"/>
+      <w:pPr>
+        <w:tabs>
+          <w:tab w:val="num" w:pos="5760"/>
+        </w:tabs>
+        <w:ind w:left="5760" w:hanging="360"/>
+      </w:pPr>
+      <w:rPr>
+        <w:rFonts w:ascii="Wingdings" w:hAnsi="Wingdings" w:hint="default"/>
+        <w:sz w:val="20"/>
+      </w:rPr>
+    </w:lvl>
+    <w:lvl w:ilvl="8" w:tentative="1">
+      <w:start w:val="1"/>
+      <w:numFmt w:val="bullet"/>
+      <w:lvlText w:val=""/>
+      <w:lvlJc w:val="left"/>
+      <w:pPr>
+        <w:tabs>
+          <w:tab w:val="num" w:pos="6480"/>
+        </w:tabs>
+        <w:ind w:left="6480" w:hanging="360"/>
+      </w:pPr>
+      <w:rPr>
+        <w:rFonts w:ascii="Wingdings" w:hAnsi="Wingdings" w:hint="default"/>
+        <w:sz w:val="20"/>
+      </w:rPr>
+    </w:lvl>
+  </w:abstractNum>
+  <w:abstractNum w:abstractNumId="10" w15:restartNumberingAfterBreak="0">
+    <w:nsid w:val="5C0F69CE"/>
+    <w:multiLevelType w:val="multilevel"/>
+    <w:tmpl w:val="BE4270C4"/>
     <w:lvl w:ilvl="0">
       <w:start w:val="1"/>
       <w:numFmt w:val="bullet"/>
@@ -4292,6 +4617,9 @@
   </w:num>
   <w:num w:numId="10" w16cid:durableId="97410664">
     <w:abstractNumId w:val="9"/>
+  </w:num>
+  <w:num w:numId="11" w16cid:durableId="1275557204">
+    <w:abstractNumId w:val="10"/>
   </w:num>
 </w:numbering>
 </file>

</xml_diff>

<commit_message>
Document performance testing procedure
</commit_message>
<xml_diff>
--- a/Test-Plan/Test_Plan_Vehicle_Service_Maintenance.docx
+++ b/Test-Plan/Test_Plan_Vehicle_Service_Maintenance.docx
@@ -1569,8 +1569,257 @@
         <w:pStyle w:val="ListBullet"/>
       </w:pPr>
       <w:r>
-        <w:t>Verify status changes and record edits are timestamped and attributed to the responsible user through the audit log.</w:t>
+        <w:t xml:space="preserve">Verify status changes and record edits are </w:t>
       </w:r>
+      <w:proofErr w:type="gramStart"/>
+      <w:r>
+        <w:t>timestamped and</w:t>
+      </w:r>
+      <w:proofErr w:type="gramEnd"/>
+      <w:r>
+        <w:t xml:space="preserve"> attributed to the responsible user through the audit log.</w:t>
+      </w:r>
+    </w:p>
+    <w:p>
+      <w:pPr>
+        <w:pStyle w:val="ListBullet"/>
+        <w:numPr>
+          <w:ilvl w:val="0"/>
+          <w:numId w:val="0"/>
+        </w:numPr>
+        <w:ind w:left="360"/>
+      </w:pPr>
+    </w:p>
+    <w:p>
+      <w:pPr>
+        <w:pStyle w:val="ListBullet"/>
+        <w:rPr>
+          <w:color w:val="4F81BD" w:themeColor="accent1"/>
+          <w:lang w:val="en-IN"/>
+          <w14:shadow w14:blurRad="38100" w14:dist="25400" w14:dir="5400000" w14:sx="100000" w14:sy="100000" w14:kx="0" w14:ky="0" w14:algn="ctr">
+            <w14:srgbClr w14:val="6E747A">
+              <w14:alpha w14:val="57000"/>
+            </w14:srgbClr>
+          </w14:shadow>
+          <w14:textOutline w14:w="0" w14:cap="flat" w14:cmpd="sng" w14:algn="ctr">
+            <w14:noFill/>
+            <w14:prstDash w14:val="solid"/>
+            <w14:round/>
+          </w14:textOutline>
+        </w:rPr>
+      </w:pPr>
+      <w:r>
+        <w:rPr>
+          <w:bCs/>
+          <w:color w:val="4F81BD" w:themeColor="accent1"/>
+          <w:lang w:val="en-IN"/>
+          <w14:shadow w14:blurRad="38100" w14:dist="25400" w14:dir="5400000" w14:sx="100000" w14:sy="100000" w14:kx="0" w14:ky="0" w14:algn="ctr">
+            <w14:srgbClr w14:val="6E747A">
+              <w14:alpha w14:val="57000"/>
+            </w14:srgbClr>
+          </w14:shadow>
+          <w14:textOutline w14:w="0" w14:cap="flat" w14:cmpd="sng" w14:algn="ctr">
+            <w14:noFill/>
+            <w14:prstDash w14:val="solid"/>
+            <w14:round/>
+          </w14:textOutline>
+        </w:rPr>
+        <w:t>5.2 Performance Test Procedure</w:t>
+      </w:r>
+    </w:p>
+    <w:p>
+      <w:pPr>
+        <w:pStyle w:val="ListBullet"/>
+        <w:rPr>
+          <w:lang w:val="en-IN"/>
+        </w:rPr>
+      </w:pPr>
+      <w:r>
+        <w:rPr>
+          <w:lang w:val="en-IN"/>
+        </w:rPr>
+        <w:t>Performance testing will evaluate the system's response time, stability and reliability under the workload specified in NFR-001.</w:t>
+      </w:r>
+    </w:p>
+    <w:p>
+      <w:pPr>
+        <w:pStyle w:val="ListBullet"/>
+        <w:numPr>
+          <w:ilvl w:val="0"/>
+          <w:numId w:val="12"/>
+        </w:numPr>
+        <w:rPr>
+          <w:lang w:val="en-IN"/>
+        </w:rPr>
+      </w:pPr>
+      <w:r>
+        <w:rPr>
+          <w:b/>
+          <w:bCs/>
+          <w:lang w:val="en-IN"/>
+        </w:rPr>
+        <w:t>Load Configuration:</w:t>
+      </w:r>
+      <w:r>
+        <w:rPr>
+          <w:lang w:val="en-IN"/>
+        </w:rPr>
+        <w:t xml:space="preserve"> Simulate 50 concurrent users accessing search, service-status and service-request review functions.</w:t>
+      </w:r>
+    </w:p>
+    <w:p>
+      <w:pPr>
+        <w:pStyle w:val="ListBullet"/>
+        <w:numPr>
+          <w:ilvl w:val="0"/>
+          <w:numId w:val="12"/>
+        </w:numPr>
+        <w:rPr>
+          <w:lang w:val="en-IN"/>
+        </w:rPr>
+      </w:pPr>
+      <w:r>
+        <w:rPr>
+          <w:b/>
+          <w:bCs/>
+          <w:lang w:val="en-IN"/>
+        </w:rPr>
+        <w:t>Test Duration:</w:t>
+      </w:r>
+      <w:r>
+        <w:rPr>
+          <w:lang w:val="en-IN"/>
+        </w:rPr>
+        <w:t xml:space="preserve"> Maintain the workload continuously for 15 minutes.</w:t>
+      </w:r>
+    </w:p>
+    <w:p>
+      <w:pPr>
+        <w:pStyle w:val="ListBullet"/>
+        <w:numPr>
+          <w:ilvl w:val="0"/>
+          <w:numId w:val="12"/>
+        </w:numPr>
+        <w:rPr>
+          <w:lang w:val="en-IN"/>
+        </w:rPr>
+      </w:pPr>
+      <w:r>
+        <w:rPr>
+          <w:b/>
+          <w:bCs/>
+          <w:lang w:val="en-IN"/>
+        </w:rPr>
+        <w:t>Measurements:</w:t>
+      </w:r>
+      <w:r>
+        <w:rPr>
+          <w:lang w:val="en-IN"/>
+        </w:rPr>
+        <w:t xml:space="preserve"> Record response times, 95th-percentile latency, successful requests, failed requests and error rate.</w:t>
+      </w:r>
+    </w:p>
+    <w:p>
+      <w:pPr>
+        <w:pStyle w:val="ListBullet"/>
+        <w:numPr>
+          <w:ilvl w:val="0"/>
+          <w:numId w:val="12"/>
+        </w:numPr>
+        <w:rPr>
+          <w:lang w:val="en-IN"/>
+        </w:rPr>
+      </w:pPr>
+      <w:r>
+        <w:rPr>
+          <w:b/>
+          <w:bCs/>
+          <w:lang w:val="en-IN"/>
+        </w:rPr>
+        <w:t>Acceptance Criteria:</w:t>
+      </w:r>
+      <w:r>
+        <w:rPr>
+          <w:lang w:val="en-IN"/>
+        </w:rPr>
+        <w:t xml:space="preserve"> The 95th-percentile response time must not exceed 2 seconds, and the error rate must remain below 1%.</w:t>
+      </w:r>
+    </w:p>
+    <w:p>
+      <w:pPr>
+        <w:pStyle w:val="ListBullet"/>
+        <w:numPr>
+          <w:ilvl w:val="0"/>
+          <w:numId w:val="12"/>
+        </w:numPr>
+        <w:rPr>
+          <w:lang w:val="en-IN"/>
+        </w:rPr>
+      </w:pPr>
+      <w:r>
+        <w:rPr>
+          <w:b/>
+          <w:bCs/>
+          <w:lang w:val="en-IN"/>
+        </w:rPr>
+        <w:t>Result Recording:</w:t>
+      </w:r>
+      <w:r>
+        <w:rPr>
+          <w:lang w:val="en-IN"/>
+        </w:rPr>
+        <w:t xml:space="preserve"> Document the test configuration, workload, observed measurements, failures and any deviations from the acceptance criteria.</w:t>
+      </w:r>
+    </w:p>
+    <w:p>
+      <w:pPr>
+        <w:pStyle w:val="ListBullet"/>
+        <w:numPr>
+          <w:ilvl w:val="0"/>
+          <w:numId w:val="12"/>
+        </w:numPr>
+        <w:rPr>
+          <w:lang w:val="en-IN"/>
+        </w:rPr>
+      </w:pPr>
+      <w:r>
+        <w:rPr>
+          <w:b/>
+          <w:bCs/>
+          <w:lang w:val="en-IN"/>
+        </w:rPr>
+        <w:t>Failure Handling:</w:t>
+      </w:r>
+      <w:r>
+        <w:rPr>
+          <w:lang w:val="en-IN"/>
+        </w:rPr>
+        <w:t xml:space="preserve"> Report unmet criteria as defects, investigate the cause, and repeat the test after corrective changes.</w:t>
+      </w:r>
+    </w:p>
+    <w:p>
+      <w:pPr>
+        <w:pStyle w:val="ListBullet"/>
+        <w:rPr>
+          <w:lang w:val="en-IN"/>
+        </w:rPr>
+      </w:pPr>
+      <w:r>
+        <w:rPr>
+          <w:lang w:val="en-IN"/>
+        </w:rPr>
+        <w:t>The performance test results must be documented before final test sign-off.</w:t>
+      </w:r>
+    </w:p>
+    <w:p>
+      <w:pPr>
+        <w:pStyle w:val="ListBullet"/>
+        <w:numPr>
+          <w:ilvl w:val="0"/>
+          <w:numId w:val="0"/>
+        </w:numPr>
+        <w:ind w:left="360"/>
+      </w:pPr>
     </w:p>
     <w:p>
       <w:pPr>
@@ -1932,6 +2181,7 @@
         <w:pStyle w:val="Heading2"/>
       </w:pPr>
       <w:r>
+        <w:lastRenderedPageBreak/>
         <w:t>7. Test Schedule</w:t>
       </w:r>
     </w:p>
@@ -2299,7 +2549,6 @@
         <w:pStyle w:val="ListBullet"/>
       </w:pPr>
       <w:r>
-        <w:lastRenderedPageBreak/>
         <w:t>Test execution records and screenshots/evidence</w:t>
       </w:r>
     </w:p>
@@ -3036,6 +3285,7 @@
         <w:pStyle w:val="Heading2"/>
       </w:pPr>
       <w:r>
+        <w:lastRenderedPageBreak/>
         <w:t>12. Suspension &amp; Resumption Criteria</w:t>
       </w:r>
     </w:p>
@@ -3118,7 +3368,6 @@
         <w:pStyle w:val="Heading2"/>
       </w:pPr>
       <w:r>
-        <w:lastRenderedPageBreak/>
         <w:t>13. Test Case Management &amp; Traceability</w:t>
       </w:r>
     </w:p>
@@ -3735,6 +3984,7 @@
           <w:bCs/>
           <w:lang w:val="en-IN"/>
         </w:rPr>
+        <w:lastRenderedPageBreak/>
         <w:t>Expected Result:</w:t>
       </w:r>
       <w:r>
@@ -3750,8 +4000,13 @@
         <w:pStyle w:val="Heading2"/>
       </w:pPr>
       <w:r>
-        <w:t>14. Test Metrics &amp; Reporting</w:t>
+        <w:t xml:space="preserve">14. </w:t>
       </w:r>
+      <w:proofErr w:type="gramStart"/>
+      <w:r>
+        <w:t>Test Metrics &amp; Reporting</w:t>
+      </w:r>
+      <w:proofErr w:type="gramEnd"/>
     </w:p>
     <w:p>
       <w:r>
@@ -3824,7 +4079,6 @@
     </w:p>
     <w:p>
       <w:r>
-        <w:lastRenderedPageBreak/>
         <w:t>Reports:</w:t>
       </w:r>
     </w:p>
@@ -4440,6 +4694,155 @@
     </w:lvl>
   </w:abstractNum>
   <w:abstractNum w:abstractNumId="10" w15:restartNumberingAfterBreak="0">
+    <w:nsid w:val="2C1B393F"/>
+    <w:multiLevelType w:val="multilevel"/>
+    <w:tmpl w:val="A51A6DAE"/>
+    <w:lvl w:ilvl="0">
+      <w:start w:val="1"/>
+      <w:numFmt w:val="bullet"/>
+      <w:lvlText w:val=""/>
+      <w:lvlJc w:val="left"/>
+      <w:pPr>
+        <w:tabs>
+          <w:tab w:val="num" w:pos="720"/>
+        </w:tabs>
+        <w:ind w:left="720" w:hanging="360"/>
+      </w:pPr>
+      <w:rPr>
+        <w:rFonts w:ascii="Symbol" w:hAnsi="Symbol" w:hint="default"/>
+        <w:sz w:val="20"/>
+      </w:rPr>
+    </w:lvl>
+    <w:lvl w:ilvl="1" w:tentative="1">
+      <w:start w:val="1"/>
+      <w:numFmt w:val="bullet"/>
+      <w:lvlText w:val="o"/>
+      <w:lvlJc w:val="left"/>
+      <w:pPr>
+        <w:tabs>
+          <w:tab w:val="num" w:pos="1440"/>
+        </w:tabs>
+        <w:ind w:left="1440" w:hanging="360"/>
+      </w:pPr>
+      <w:rPr>
+        <w:rFonts w:ascii="Courier New" w:hAnsi="Courier New" w:hint="default"/>
+        <w:sz w:val="20"/>
+      </w:rPr>
+    </w:lvl>
+    <w:lvl w:ilvl="2" w:tentative="1">
+      <w:start w:val="1"/>
+      <w:numFmt w:val="bullet"/>
+      <w:lvlText w:val=""/>
+      <w:lvlJc w:val="left"/>
+      <w:pPr>
+        <w:tabs>
+          <w:tab w:val="num" w:pos="2160"/>
+        </w:tabs>
+        <w:ind w:left="2160" w:hanging="360"/>
+      </w:pPr>
+      <w:rPr>
+        <w:rFonts w:ascii="Wingdings" w:hAnsi="Wingdings" w:hint="default"/>
+        <w:sz w:val="20"/>
+      </w:rPr>
+    </w:lvl>
+    <w:lvl w:ilvl="3" w:tentative="1">
+      <w:start w:val="1"/>
+      <w:numFmt w:val="bullet"/>
+      <w:lvlText w:val=""/>
+      <w:lvlJc w:val="left"/>
+      <w:pPr>
+        <w:tabs>
+          <w:tab w:val="num" w:pos="2880"/>
+        </w:tabs>
+        <w:ind w:left="2880" w:hanging="360"/>
+      </w:pPr>
+      <w:rPr>
+        <w:rFonts w:ascii="Wingdings" w:hAnsi="Wingdings" w:hint="default"/>
+        <w:sz w:val="20"/>
+      </w:rPr>
+    </w:lvl>
+    <w:lvl w:ilvl="4" w:tentative="1">
+      <w:start w:val="1"/>
+      <w:numFmt w:val="bullet"/>
+      <w:lvlText w:val=""/>
+      <w:lvlJc w:val="left"/>
+      <w:pPr>
+        <w:tabs>
+          <w:tab w:val="num" w:pos="3600"/>
+        </w:tabs>
+        <w:ind w:left="3600" w:hanging="360"/>
+      </w:pPr>
+      <w:rPr>
+        <w:rFonts w:ascii="Wingdings" w:hAnsi="Wingdings" w:hint="default"/>
+        <w:sz w:val="20"/>
+      </w:rPr>
+    </w:lvl>
+    <w:lvl w:ilvl="5" w:tentative="1">
+      <w:start w:val="1"/>
+      <w:numFmt w:val="bullet"/>
+      <w:lvlText w:val=""/>
+      <w:lvlJc w:val="left"/>
+      <w:pPr>
+        <w:tabs>
+          <w:tab w:val="num" w:pos="4320"/>
+        </w:tabs>
+        <w:ind w:left="4320" w:hanging="360"/>
+      </w:pPr>
+      <w:rPr>
+        <w:rFonts w:ascii="Wingdings" w:hAnsi="Wingdings" w:hint="default"/>
+        <w:sz w:val="20"/>
+      </w:rPr>
+    </w:lvl>
+    <w:lvl w:ilvl="6" w:tentative="1">
+      <w:start w:val="1"/>
+      <w:numFmt w:val="bullet"/>
+      <w:lvlText w:val=""/>
+      <w:lvlJc w:val="left"/>
+      <w:pPr>
+        <w:tabs>
+          <w:tab w:val="num" w:pos="5040"/>
+        </w:tabs>
+        <w:ind w:left="5040" w:hanging="360"/>
+      </w:pPr>
+      <w:rPr>
+        <w:rFonts w:ascii="Wingdings" w:hAnsi="Wingdings" w:hint="default"/>
+        <w:sz w:val="20"/>
+      </w:rPr>
+    </w:lvl>
+    <w:lvl w:ilvl="7" w:tentative="1">
+      <w:start w:val="1"/>
+      <w:numFmt w:val="bullet"/>
+      <w:lvlText w:val=""/>
+      <w:lvlJc w:val="left"/>
+      <w:pPr>
+        <w:tabs>
+          <w:tab w:val="num" w:pos="5760"/>
+        </w:tabs>
+        <w:ind w:left="5760" w:hanging="360"/>
+      </w:pPr>
+      <w:rPr>
+        <w:rFonts w:ascii="Wingdings" w:hAnsi="Wingdings" w:hint="default"/>
+        <w:sz w:val="20"/>
+      </w:rPr>
+    </w:lvl>
+    <w:lvl w:ilvl="8" w:tentative="1">
+      <w:start w:val="1"/>
+      <w:numFmt w:val="bullet"/>
+      <w:lvlText w:val=""/>
+      <w:lvlJc w:val="left"/>
+      <w:pPr>
+        <w:tabs>
+          <w:tab w:val="num" w:pos="6480"/>
+        </w:tabs>
+        <w:ind w:left="6480" w:hanging="360"/>
+      </w:pPr>
+      <w:rPr>
+        <w:rFonts w:ascii="Wingdings" w:hAnsi="Wingdings" w:hint="default"/>
+        <w:sz w:val="20"/>
+      </w:rPr>
+    </w:lvl>
+  </w:abstractNum>
+  <w:abstractNum w:abstractNumId="11" w15:restartNumberingAfterBreak="0">
     <w:nsid w:val="5C0F69CE"/>
     <w:multiLevelType w:val="multilevel"/>
     <w:tmpl w:val="BE4270C4"/>
@@ -4619,6 +5022,9 @@
     <w:abstractNumId w:val="9"/>
   </w:num>
   <w:num w:numId="11" w16cid:durableId="1275557204">
+    <w:abstractNumId w:val="11"/>
+  </w:num>
+  <w:num w:numId="12" w16cid:durableId="500589304">
     <w:abstractNumId w:val="10"/>
   </w:num>
 </w:numbering>

</xml_diff>

<commit_message>
Expand security validation and access checks
</commit_message>
<xml_diff>
--- a/Test-Plan/Test_Plan_Vehicle_Service_Maintenance.docx
+++ b/Test-Plan/Test_Plan_Vehicle_Service_Maintenance.docx
@@ -2178,10 +2178,210 @@
     <w:p/>
     <w:p>
       <w:pPr>
+        <w:rPr>
+          <w:lang w:val="en-IN"/>
+        </w:rPr>
+      </w:pPr>
+      <w:r>
+        <w:rPr>
+          <w:b/>
+          <w:bCs/>
+          <w:lang w:val="en-IN"/>
+        </w:rPr>
+        <w:lastRenderedPageBreak/>
+        <w:t>Security Test Scenarios</w:t>
+      </w:r>
+    </w:p>
+    <w:p>
+      <w:pPr>
+        <w:numPr>
+          <w:ilvl w:val="0"/>
+          <w:numId w:val="13"/>
+        </w:numPr>
+        <w:rPr>
+          <w:lang w:val="en-IN"/>
+        </w:rPr>
+      </w:pPr>
+      <w:r>
+        <w:rPr>
+          <w:b/>
+          <w:bCs/>
+          <w:lang w:val="en-IN"/>
+        </w:rPr>
+        <w:t>SEC-01 — HTTPS/TLS Validation:</w:t>
+      </w:r>
+      <w:r>
+        <w:rPr>
+          <w:lang w:val="en-IN"/>
+        </w:rPr>
+        <w:t xml:space="preserve"> Verify that the application uses HTTPS and rejects connections using protocols below TLS 1.2.</w:t>
+      </w:r>
+    </w:p>
+    <w:p>
+      <w:pPr>
+        <w:numPr>
+          <w:ilvl w:val="0"/>
+          <w:numId w:val="13"/>
+        </w:numPr>
+        <w:rPr>
+          <w:lang w:val="en-IN"/>
+        </w:rPr>
+      </w:pPr>
+      <w:r>
+        <w:rPr>
+          <w:b/>
+          <w:bCs/>
+          <w:lang w:val="en-IN"/>
+        </w:rPr>
+        <w:t>SEC-02 — Password Storage:</w:t>
+      </w:r>
+      <w:r>
+        <w:rPr>
+          <w:lang w:val="en-IN"/>
+        </w:rPr>
+        <w:t xml:space="preserve"> Verify that passwords are stored using salted adaptive hashing, such as </w:t>
+      </w:r>
+      <w:proofErr w:type="spellStart"/>
+      <w:r>
+        <w:rPr>
+          <w:lang w:val="en-IN"/>
+        </w:rPr>
+        <w:t>bcrypt</w:t>
+      </w:r>
+      <w:proofErr w:type="spellEnd"/>
+      <w:r>
+        <w:rPr>
+          <w:lang w:val="en-IN"/>
+        </w:rPr>
+        <w:t xml:space="preserve"> or Argon2, rather than plaintext.</w:t>
+      </w:r>
+    </w:p>
+    <w:p>
+      <w:pPr>
+        <w:numPr>
+          <w:ilvl w:val="0"/>
+          <w:numId w:val="13"/>
+        </w:numPr>
+        <w:rPr>
+          <w:lang w:val="en-IN"/>
+        </w:rPr>
+      </w:pPr>
+      <w:r>
+        <w:rPr>
+          <w:b/>
+          <w:bCs/>
+          <w:lang w:val="en-IN"/>
+        </w:rPr>
+        <w:t>SEC-03 — Role-Based Access Control:</w:t>
+      </w:r>
+      <w:r>
+        <w:rPr>
+          <w:lang w:val="en-IN"/>
+        </w:rPr>
+        <w:t xml:space="preserve"> Verify that Customer, Service Advisor, Technician and Administrator accounts can access only their permitted functions.</w:t>
+      </w:r>
+    </w:p>
+    <w:p>
+      <w:pPr>
+        <w:numPr>
+          <w:ilvl w:val="0"/>
+          <w:numId w:val="13"/>
+        </w:numPr>
+        <w:rPr>
+          <w:lang w:val="en-IN"/>
+        </w:rPr>
+      </w:pPr>
+      <w:r>
+        <w:rPr>
+          <w:b/>
+          <w:bCs/>
+          <w:lang w:val="en-IN"/>
+        </w:rPr>
+        <w:t>SEC-04 — Unauthorized Operations:</w:t>
+      </w:r>
+      <w:r>
+        <w:rPr>
+          <w:lang w:val="en-IN"/>
+        </w:rPr>
+        <w:t xml:space="preserve"> Attempt restricted operations using an account without the required permissions and verify that access is denied.</w:t>
+      </w:r>
+    </w:p>
+    <w:p>
+      <w:pPr>
+        <w:numPr>
+          <w:ilvl w:val="0"/>
+          <w:numId w:val="13"/>
+        </w:numPr>
+        <w:rPr>
+          <w:lang w:val="en-IN"/>
+        </w:rPr>
+      </w:pPr>
+      <w:r>
+        <w:rPr>
+          <w:b/>
+          <w:bCs/>
+          <w:lang w:val="en-IN"/>
+        </w:rPr>
+        <w:t>SEC-05 — Account Deactivation:</w:t>
+      </w:r>
+      <w:r>
+        <w:rPr>
+          <w:lang w:val="en-IN"/>
+        </w:rPr>
+        <w:t xml:space="preserve"> Verify that deactivated accounts cannot authenticate successfully.</w:t>
+      </w:r>
+    </w:p>
+    <w:p>
+      <w:pPr>
+        <w:numPr>
+          <w:ilvl w:val="0"/>
+          <w:numId w:val="13"/>
+        </w:numPr>
+        <w:rPr>
+          <w:lang w:val="en-IN"/>
+        </w:rPr>
+      </w:pPr>
+      <w:r>
+        <w:rPr>
+          <w:b/>
+          <w:bCs/>
+          <w:lang w:val="en-IN"/>
+        </w:rPr>
+        <w:t>SEC-06 — Audit Logging:</w:t>
+      </w:r>
+      <w:r>
+        <w:rPr>
+          <w:lang w:val="en-IN"/>
+        </w:rPr>
+        <w:t xml:space="preserve"> Verify that relevant status changes and record edits are timestamped and attributed to the responsible user.</w:t>
+      </w:r>
+    </w:p>
+    <w:p>
+      <w:pPr>
+        <w:rPr>
+          <w:lang w:val="en-IN"/>
+        </w:rPr>
+      </w:pPr>
+      <w:r>
+        <w:rPr>
+          <w:b/>
+          <w:bCs/>
+          <w:lang w:val="en-IN"/>
+        </w:rPr>
+        <w:t>Expected Result:</w:t>
+      </w:r>
+      <w:r>
+        <w:rPr>
+          <w:lang w:val="en-IN"/>
+        </w:rPr>
+        <w:t xml:space="preserve"> All security checks must satisfy the corresponding SRS requirements. Any failure must be documented, assigned for correction and retested before final sign-off.</w:t>
+      </w:r>
+    </w:p>
+    <w:p>
+      <w:pPr>
         <w:pStyle w:val="Heading2"/>
       </w:pPr>
       <w:r>
-        <w:lastRenderedPageBreak/>
         <w:t>7. Test Schedule</w:t>
       </w:r>
     </w:p>
@@ -2899,6 +3099,7 @@
         <w:pStyle w:val="Heading2"/>
       </w:pPr>
       <w:r>
+        <w:lastRenderedPageBreak/>
         <w:t>10. Risks and Mitigation</w:t>
       </w:r>
     </w:p>
@@ -3285,7 +3486,6 @@
         <w:pStyle w:val="Heading2"/>
       </w:pPr>
       <w:r>
-        <w:lastRenderedPageBreak/>
         <w:t>12. Suspension &amp; Resumption Criteria</w:t>
       </w:r>
     </w:p>
@@ -3737,6 +3937,7 @@
               <w:rPr>
                 <w:sz w:val="16"/>
               </w:rPr>
+              <w:lastRenderedPageBreak/>
               <w:t>NFR-001 Performance</w:t>
             </w:r>
           </w:p>
@@ -3984,7 +4185,6 @@
           <w:bCs/>
           <w:lang w:val="en-IN"/>
         </w:rPr>
-        <w:lastRenderedPageBreak/>
         <w:t>Expected Result:</w:t>
       </w:r>
       <w:r>
@@ -4354,12 +4554,6 @@
       <w:pPr>
         <w:jc w:val="center"/>
       </w:pPr>
-      <w:r>
-        <w:rPr>
-          <w:b/>
-        </w:rPr>
-        <w:t>End of Software Test Plan</w:t>
-      </w:r>
     </w:p>
     <w:sectPr>
       <w:pgSz w:w="12240" w:h="15840"/>
@@ -4846,6 +5040,155 @@
     <w:nsid w:val="5C0F69CE"/>
     <w:multiLevelType w:val="multilevel"/>
     <w:tmpl w:val="BE4270C4"/>
+    <w:lvl w:ilvl="0">
+      <w:start w:val="1"/>
+      <w:numFmt w:val="bullet"/>
+      <w:lvlText w:val=""/>
+      <w:lvlJc w:val="left"/>
+      <w:pPr>
+        <w:tabs>
+          <w:tab w:val="num" w:pos="720"/>
+        </w:tabs>
+        <w:ind w:left="720" w:hanging="360"/>
+      </w:pPr>
+      <w:rPr>
+        <w:rFonts w:ascii="Symbol" w:hAnsi="Symbol" w:hint="default"/>
+        <w:sz w:val="20"/>
+      </w:rPr>
+    </w:lvl>
+    <w:lvl w:ilvl="1" w:tentative="1">
+      <w:start w:val="1"/>
+      <w:numFmt w:val="bullet"/>
+      <w:lvlText w:val="o"/>
+      <w:lvlJc w:val="left"/>
+      <w:pPr>
+        <w:tabs>
+          <w:tab w:val="num" w:pos="1440"/>
+        </w:tabs>
+        <w:ind w:left="1440" w:hanging="360"/>
+      </w:pPr>
+      <w:rPr>
+        <w:rFonts w:ascii="Courier New" w:hAnsi="Courier New" w:hint="default"/>
+        <w:sz w:val="20"/>
+      </w:rPr>
+    </w:lvl>
+    <w:lvl w:ilvl="2" w:tentative="1">
+      <w:start w:val="1"/>
+      <w:numFmt w:val="bullet"/>
+      <w:lvlText w:val=""/>
+      <w:lvlJc w:val="left"/>
+      <w:pPr>
+        <w:tabs>
+          <w:tab w:val="num" w:pos="2160"/>
+        </w:tabs>
+        <w:ind w:left="2160" w:hanging="360"/>
+      </w:pPr>
+      <w:rPr>
+        <w:rFonts w:ascii="Wingdings" w:hAnsi="Wingdings" w:hint="default"/>
+        <w:sz w:val="20"/>
+      </w:rPr>
+    </w:lvl>
+    <w:lvl w:ilvl="3" w:tentative="1">
+      <w:start w:val="1"/>
+      <w:numFmt w:val="bullet"/>
+      <w:lvlText w:val=""/>
+      <w:lvlJc w:val="left"/>
+      <w:pPr>
+        <w:tabs>
+          <w:tab w:val="num" w:pos="2880"/>
+        </w:tabs>
+        <w:ind w:left="2880" w:hanging="360"/>
+      </w:pPr>
+      <w:rPr>
+        <w:rFonts w:ascii="Wingdings" w:hAnsi="Wingdings" w:hint="default"/>
+        <w:sz w:val="20"/>
+      </w:rPr>
+    </w:lvl>
+    <w:lvl w:ilvl="4" w:tentative="1">
+      <w:start w:val="1"/>
+      <w:numFmt w:val="bullet"/>
+      <w:lvlText w:val=""/>
+      <w:lvlJc w:val="left"/>
+      <w:pPr>
+        <w:tabs>
+          <w:tab w:val="num" w:pos="3600"/>
+        </w:tabs>
+        <w:ind w:left="3600" w:hanging="360"/>
+      </w:pPr>
+      <w:rPr>
+        <w:rFonts w:ascii="Wingdings" w:hAnsi="Wingdings" w:hint="default"/>
+        <w:sz w:val="20"/>
+      </w:rPr>
+    </w:lvl>
+    <w:lvl w:ilvl="5" w:tentative="1">
+      <w:start w:val="1"/>
+      <w:numFmt w:val="bullet"/>
+      <w:lvlText w:val=""/>
+      <w:lvlJc w:val="left"/>
+      <w:pPr>
+        <w:tabs>
+          <w:tab w:val="num" w:pos="4320"/>
+        </w:tabs>
+        <w:ind w:left="4320" w:hanging="360"/>
+      </w:pPr>
+      <w:rPr>
+        <w:rFonts w:ascii="Wingdings" w:hAnsi="Wingdings" w:hint="default"/>
+        <w:sz w:val="20"/>
+      </w:rPr>
+    </w:lvl>
+    <w:lvl w:ilvl="6" w:tentative="1">
+      <w:start w:val="1"/>
+      <w:numFmt w:val="bullet"/>
+      <w:lvlText w:val=""/>
+      <w:lvlJc w:val="left"/>
+      <w:pPr>
+        <w:tabs>
+          <w:tab w:val="num" w:pos="5040"/>
+        </w:tabs>
+        <w:ind w:left="5040" w:hanging="360"/>
+      </w:pPr>
+      <w:rPr>
+        <w:rFonts w:ascii="Wingdings" w:hAnsi="Wingdings" w:hint="default"/>
+        <w:sz w:val="20"/>
+      </w:rPr>
+    </w:lvl>
+    <w:lvl w:ilvl="7" w:tentative="1">
+      <w:start w:val="1"/>
+      <w:numFmt w:val="bullet"/>
+      <w:lvlText w:val=""/>
+      <w:lvlJc w:val="left"/>
+      <w:pPr>
+        <w:tabs>
+          <w:tab w:val="num" w:pos="5760"/>
+        </w:tabs>
+        <w:ind w:left="5760" w:hanging="360"/>
+      </w:pPr>
+      <w:rPr>
+        <w:rFonts w:ascii="Wingdings" w:hAnsi="Wingdings" w:hint="default"/>
+        <w:sz w:val="20"/>
+      </w:rPr>
+    </w:lvl>
+    <w:lvl w:ilvl="8" w:tentative="1">
+      <w:start w:val="1"/>
+      <w:numFmt w:val="bullet"/>
+      <w:lvlText w:val=""/>
+      <w:lvlJc w:val="left"/>
+      <w:pPr>
+        <w:tabs>
+          <w:tab w:val="num" w:pos="6480"/>
+        </w:tabs>
+        <w:ind w:left="6480" w:hanging="360"/>
+      </w:pPr>
+      <w:rPr>
+        <w:rFonts w:ascii="Wingdings" w:hAnsi="Wingdings" w:hint="default"/>
+        <w:sz w:val="20"/>
+      </w:rPr>
+    </w:lvl>
+  </w:abstractNum>
+  <w:abstractNum w:abstractNumId="12" w15:restartNumberingAfterBreak="0">
+    <w:nsid w:val="6D343F48"/>
+    <w:multiLevelType w:val="multilevel"/>
+    <w:tmpl w:val="F788D2F8"/>
     <w:lvl w:ilvl="0">
       <w:start w:val="1"/>
       <w:numFmt w:val="bullet"/>
@@ -5026,6 +5369,9 @@
   </w:num>
   <w:num w:numId="12" w16cid:durableId="500589304">
     <w:abstractNumId w:val="10"/>
+  </w:num>
+  <w:num w:numId="13" w16cid:durableId="2110349584">
+    <w:abstractNumId w:val="12"/>
   </w:num>
 </w:numbering>
 </file>

</xml_diff>

<commit_message>
Finalize technology stack and project setup
</commit_message>
<xml_diff>
--- a/Test-Plan/Test_Plan_Vehicle_Service_Maintenance.docx
+++ b/Test-Plan/Test_Plan_Vehicle_Service_Maintenance.docx
@@ -59,7 +59,13 @@
         <w:rPr>
           <w:sz w:val="20"/>
         </w:rPr>
-        <w:t>Version 1.0</w:t>
+        <w:t>Version 1.</w:t>
+      </w:r>
+      <w:r>
+        <w:rPr>
+          <w:sz w:val="20"/>
+        </w:rPr>
+        <w:t>1</w:t>
       </w:r>
       <w:r>
         <w:rPr>
@@ -1569,15 +1575,7 @@
         <w:pStyle w:val="ListBullet"/>
       </w:pPr>
       <w:r>
-        <w:t xml:space="preserve">Verify status changes and record edits are </w:t>
-      </w:r>
-      <w:proofErr w:type="gramStart"/>
-      <w:r>
-        <w:t>timestamped and</w:t>
-      </w:r>
-      <w:proofErr w:type="gramEnd"/>
-      <w:r>
-        <w:t xml:space="preserve"> attributed to the responsible user through the audit log.</w:t>
+        <w:t>Verify status changes and record edits are timestamped and attributed to the responsible user through the audit log.</w:t>
       </w:r>
     </w:p>
     <w:p>
@@ -2004,7 +2002,7 @@
               <w:rPr>
                 <w:sz w:val="16"/>
               </w:rPr>
-              <w:t>PostgreSQL or MySQL 8+ relational database</w:t>
+              <w:t>SQLite and document the persistent-storage and backup plan.</w:t>
             </w:r>
           </w:p>
         </w:tc>
@@ -2239,21 +2237,7 @@
         <w:rPr>
           <w:lang w:val="en-IN"/>
         </w:rPr>
-        <w:t xml:space="preserve"> Verify that passwords are stored using salted adaptive hashing, such as </w:t>
-      </w:r>
-      <w:proofErr w:type="spellStart"/>
-      <w:r>
-        <w:rPr>
-          <w:lang w:val="en-IN"/>
-        </w:rPr>
-        <w:t>bcrypt</w:t>
-      </w:r>
-      <w:proofErr w:type="spellEnd"/>
-      <w:r>
-        <w:rPr>
-          <w:lang w:val="en-IN"/>
-        </w:rPr>
-        <w:t xml:space="preserve"> or Argon2, rather than plaintext.</w:t>
+        <w:t xml:space="preserve"> Verify that passwords are stored using salted adaptive hashing, such as bcrypt or Argon2, rather than plaintext.</w:t>
       </w:r>
     </w:p>
     <w:p>
@@ -4200,13 +4184,8 @@
         <w:pStyle w:val="Heading2"/>
       </w:pPr>
       <w:r>
-        <w:t xml:space="preserve">14. </w:t>
+        <w:t>14. Test Metrics &amp; Reporting</w:t>
       </w:r>
-      <w:proofErr w:type="gramStart"/>
-      <w:r>
-        <w:t>Test Metrics &amp; Reporting</w:t>
-      </w:r>
-      <w:proofErr w:type="gramEnd"/>
     </w:p>
     <w:p>
       <w:r>
@@ -5983,6 +5962,7 @@
   <w:style w:type="character" w:default="1" w:styleId="DefaultParagraphFont">
     <w:name w:val="Default Paragraph Font"/>
     <w:uiPriority w:val="1"/>
+    <w:semiHidden/>
     <w:unhideWhenUsed/>
   </w:style>
   <w:style w:type="table" w:default="1" w:styleId="TableNormal">

</xml_diff>